<commit_message>
docs: add full Thai language Word report and Markdown overview documentation
</commit_message>
<xml_diff>
--- a/Project_Benchmark_Overview.docx
+++ b/Project_Benchmark_Overview.docx
@@ -1124,7 +1124,7 @@
         <w:spacing w:after="120"/>
       </w:pPr>
       <w:r>
-        <w:t>All suites are evaluated across 3 standardized load tiers using the wrk load generator:</w:t>
+        <w:t>All suites are evaluated across 5 standardized production load scenarios using the wrk load generator:</w:t>
       </w:r>
     </w:p>
     <w:tbl>
@@ -1144,7 +1144,7 @@
       <w:tr>
         <w:tc>
           <w:tcPr>
-            <w:tcW w:type="dxa" w:w="1872"/>
+            <w:tcW w:type="dxa" w:w="2304"/>
             <w:shd w:fill="1A365D"/>
             <w:tcMar>
               <w:top w:w="140" w:type="dxa"/>
@@ -1164,13 +1164,13 @@
                 <w:color w:val="FFFFFF"/>
                 <w:sz w:val="20"/>
               </w:rPr>
-              <w:t>Load Tier</w:t>
+              <w:t>Scenario</w:t>
             </w:r>
           </w:p>
         </w:tc>
         <w:tc>
           <w:tcPr>
-            <w:tcW w:type="dxa" w:w="1728"/>
+            <w:tcW w:type="dxa" w:w="2880"/>
             <w:shd w:fill="1A365D"/>
             <w:tcMar>
               <w:top w:w="140" w:type="dxa"/>
@@ -1190,13 +1190,13 @@
                 <w:color w:val="FFFFFF"/>
                 <w:sz w:val="20"/>
               </w:rPr>
-              <w:t>Concurrency (-c)</w:t>
+              <w:t>Typical Website</w:t>
             </w:r>
           </w:p>
         </w:tc>
         <w:tc>
           <w:tcPr>
-            <w:tcW w:type="dxa" w:w="1440"/>
+            <w:tcW w:type="dxa" w:w="1296"/>
             <w:shd w:fill="1A365D"/>
             <w:tcMar>
               <w:top w:w="140" w:type="dxa"/>
@@ -1222,7 +1222,33 @@
         </w:tc>
         <w:tc>
           <w:tcPr>
-            <w:tcW w:type="dxa" w:w="1440"/>
+            <w:tcW w:type="dxa" w:w="1584"/>
+            <w:shd w:fill="1A365D"/>
+            <w:tcMar>
+              <w:top w:w="140" w:type="dxa"/>
+              <w:bottom w:w="140" w:type="dxa"/>
+              <w:left w:w="160" w:type="dxa"/>
+              <w:right w:w="160" w:type="dxa"/>
+            </w:tcMar>
+          </w:tcPr>
+          <w:p>
+            <w:pPr>
+              <w:jc w:val="left"/>
+            </w:pPr>
+            <w:r>
+              <w:rPr>
+                <w:rFonts w:ascii="Calibri" w:hAnsi="Calibri"/>
+                <w:b/>
+                <w:color w:val="FFFFFF"/>
+                <w:sz w:val="20"/>
+              </w:rPr>
+              <w:t>Connections (-c)</w:t>
+            </w:r>
+          </w:p>
+        </w:tc>
+        <w:tc>
+          <w:tcPr>
+            <w:tcW w:type="dxa" w:w="1296"/>
             <w:shd w:fill="1A365D"/>
             <w:tcMar>
               <w:top w:w="140" w:type="dxa"/>
@@ -1246,37 +1272,11 @@
             </w:r>
           </w:p>
         </w:tc>
-        <w:tc>
-          <w:tcPr>
-            <w:tcW w:type="dxa" w:w="3312"/>
-            <w:shd w:fill="1A365D"/>
-            <w:tcMar>
-              <w:top w:w="140" w:type="dxa"/>
-              <w:bottom w:w="140" w:type="dxa"/>
-              <w:left w:w="160" w:type="dxa"/>
-              <w:right w:w="160" w:type="dxa"/>
-            </w:tcMar>
-          </w:tcPr>
-          <w:p>
-            <w:pPr>
-              <w:jc w:val="left"/>
-            </w:pPr>
-            <w:r>
-              <w:rPr>
-                <w:rFonts w:ascii="Calibri" w:hAnsi="Calibri"/>
-                <w:b/>
-                <w:color w:val="FFFFFF"/>
-                <w:sz w:val="20"/>
-              </w:rPr>
-              <w:t>Purpose &amp; Target Environment</w:t>
-            </w:r>
-          </w:p>
-        </w:tc>
       </w:tr>
       <w:tr>
         <w:tc>
           <w:tcPr>
-            <w:tcW w:type="dxa" w:w="1872"/>
+            <w:tcW w:type="dxa" w:w="2304"/>
             <w:shd w:fill="FFFFFF"/>
             <w:tcMar>
               <w:top w:w="100" w:type="dxa"/>
@@ -1295,13 +1295,13 @@
                 <w:color w:val="2D3748"/>
                 <w:sz w:val="19"/>
               </w:rPr>
-              <w:t>Minimum (Light)</w:t>
+              <w:t>POC / Small internal system</w:t>
             </w:r>
           </w:p>
         </w:tc>
         <w:tc>
           <w:tcPr>
-            <w:tcW w:type="dxa" w:w="1728"/>
+            <w:tcW w:type="dxa" w:w="2880"/>
             <w:shd w:fill="FFFFFF"/>
             <w:tcMar>
               <w:top w:w="100" w:type="dxa"/>
@@ -1320,13 +1320,13 @@
                 <w:color w:val="2D3748"/>
                 <w:sz w:val="19"/>
               </w:rPr>
-              <w:t>100 connections</w:t>
+              <w:t>Thesis project, department website prototype</w:t>
             </w:r>
           </w:p>
         </w:tc>
         <w:tc>
           <w:tcPr>
-            <w:tcW w:type="dxa" w:w="1440"/>
+            <w:tcW w:type="dxa" w:w="1296"/>
             <w:shd w:fill="FFFFFF"/>
             <w:tcMar>
               <w:top w:w="100" w:type="dxa"/>
@@ -1345,13 +1345,13 @@
                 <w:color w:val="2D3748"/>
                 <w:sz w:val="19"/>
               </w:rPr>
-              <w:t>2 threads</w:t>
+              <w:t>2</w:t>
             </w:r>
           </w:p>
         </w:tc>
         <w:tc>
           <w:tcPr>
-            <w:tcW w:type="dxa" w:w="1440"/>
+            <w:tcW w:type="dxa" w:w="1584"/>
             <w:shd w:fill="FFFFFF"/>
             <w:tcMar>
               <w:top w:w="100" w:type="dxa"/>
@@ -1370,13 +1370,13 @@
                 <w:color w:val="2D3748"/>
                 <w:sz w:val="19"/>
               </w:rPr>
-              <w:t>10 seconds</w:t>
+              <w:t>20</w:t>
             </w:r>
           </w:p>
         </w:tc>
         <w:tc>
           <w:tcPr>
-            <w:tcW w:type="dxa" w:w="3312"/>
+            <w:tcW w:type="dxa" w:w="1296"/>
             <w:shd w:fill="FFFFFF"/>
             <w:tcMar>
               <w:top w:w="100" w:type="dxa"/>
@@ -1395,7 +1395,7 @@
                 <w:color w:val="2D3748"/>
                 <w:sz w:val="19"/>
               </w:rPr>
-              <w:t>Baseline latency &amp; throughput verification</w:t>
+              <w:t>30s</w:t>
             </w:r>
           </w:p>
         </w:tc>
@@ -1403,7 +1403,7 @@
       <w:tr>
         <w:tc>
           <w:tcPr>
-            <w:tcW w:type="dxa" w:w="1872"/>
+            <w:tcW w:type="dxa" w:w="2304"/>
             <w:shd w:fill="F7FAFC"/>
             <w:tcMar>
               <w:top w:w="100" w:type="dxa"/>
@@ -1422,13 +1422,13 @@
                 <w:color w:val="2D3748"/>
                 <w:sz w:val="19"/>
               </w:rPr>
-              <w:t>Medium (Standard)</w:t>
+              <w:t>Small production website</w:t>
             </w:r>
           </w:p>
         </w:tc>
         <w:tc>
           <w:tcPr>
-            <w:tcW w:type="dxa" w:w="1728"/>
+            <w:tcW w:type="dxa" w:w="2880"/>
             <w:shd w:fill="F7FAFC"/>
             <w:tcMar>
               <w:top w:w="100" w:type="dxa"/>
@@ -1447,13 +1447,13 @@
                 <w:color w:val="2D3748"/>
                 <w:sz w:val="19"/>
               </w:rPr>
-              <w:t>1,000 connections</w:t>
+              <w:t>Small company local business</w:t>
             </w:r>
           </w:p>
         </w:tc>
         <w:tc>
           <w:tcPr>
-            <w:tcW w:type="dxa" w:w="1440"/>
+            <w:tcW w:type="dxa" w:w="1296"/>
             <w:shd w:fill="F7FAFC"/>
             <w:tcMar>
               <w:top w:w="100" w:type="dxa"/>
@@ -1472,13 +1472,13 @@
                 <w:color w:val="2D3748"/>
                 <w:sz w:val="19"/>
               </w:rPr>
-              <w:t>10 threads</w:t>
+              <w:t>4</w:t>
             </w:r>
           </w:p>
         </w:tc>
         <w:tc>
           <w:tcPr>
-            <w:tcW w:type="dxa" w:w="1440"/>
+            <w:tcW w:type="dxa" w:w="1584"/>
             <w:shd w:fill="F7FAFC"/>
             <w:tcMar>
               <w:top w:w="100" w:type="dxa"/>
@@ -1497,13 +1497,13 @@
                 <w:color w:val="2D3748"/>
                 <w:sz w:val="19"/>
               </w:rPr>
-              <w:t>30 seconds</w:t>
+              <w:t>100</w:t>
             </w:r>
           </w:p>
         </w:tc>
         <w:tc>
           <w:tcPr>
-            <w:tcW w:type="dxa" w:w="3312"/>
+            <w:tcW w:type="dxa" w:w="1296"/>
             <w:shd w:fill="F7FAFC"/>
             <w:tcMar>
               <w:top w:w="100" w:type="dxa"/>
@@ -1522,7 +1522,7 @@
                 <w:color w:val="2D3748"/>
                 <w:sz w:val="19"/>
               </w:rPr>
-              <w:t>Realistic production peak-traffic load</w:t>
+              <w:t>60s</w:t>
             </w:r>
           </w:p>
         </w:tc>
@@ -1530,7 +1530,7 @@
       <w:tr>
         <w:tc>
           <w:tcPr>
-            <w:tcW w:type="dxa" w:w="1872"/>
+            <w:tcW w:type="dxa" w:w="2304"/>
             <w:shd w:fill="FFFFFF"/>
             <w:tcMar>
               <w:top w:w="100" w:type="dxa"/>
@@ -1549,13 +1549,13 @@
                 <w:color w:val="2D3748"/>
                 <w:sz w:val="19"/>
               </w:rPr>
-              <w:t>Maximum (Stress)</w:t>
+              <w:t>General web application</w:t>
             </w:r>
           </w:p>
         </w:tc>
         <w:tc>
           <w:tcPr>
-            <w:tcW w:type="dxa" w:w="1728"/>
+            <w:tcW w:type="dxa" w:w="2880"/>
             <w:shd w:fill="FFFFFF"/>
             <w:tcMar>
               <w:top w:w="100" w:type="dxa"/>
@@ -1574,13 +1574,13 @@
                 <w:color w:val="2D3748"/>
                 <w:sz w:val="19"/>
               </w:rPr>
-              <w:t>10,000 connections</w:t>
+              <w:t>University system e-commerce CMS</w:t>
             </w:r>
           </w:p>
         </w:tc>
         <w:tc>
           <w:tcPr>
-            <w:tcW w:type="dxa" w:w="1440"/>
+            <w:tcW w:type="dxa" w:w="1296"/>
             <w:shd w:fill="FFFFFF"/>
             <w:tcMar>
               <w:top w:w="100" w:type="dxa"/>
@@ -1599,13 +1599,13 @@
                 <w:color w:val="2D3748"/>
                 <w:sz w:val="19"/>
               </w:rPr>
-              <w:t>20 threads</w:t>
+              <w:t>8</w:t>
             </w:r>
           </w:p>
         </w:tc>
         <w:tc>
           <w:tcPr>
-            <w:tcW w:type="dxa" w:w="1440"/>
+            <w:tcW w:type="dxa" w:w="1584"/>
             <w:shd w:fill="FFFFFF"/>
             <w:tcMar>
               <w:top w:w="100" w:type="dxa"/>
@@ -1624,13 +1624,13 @@
                 <w:color w:val="2D3748"/>
                 <w:sz w:val="19"/>
               </w:rPr>
-              <w:t>30 seconds</w:t>
+              <w:t>500</w:t>
             </w:r>
           </w:p>
         </w:tc>
         <w:tc>
           <w:tcPr>
-            <w:tcW w:type="dxa" w:w="3312"/>
+            <w:tcW w:type="dxa" w:w="1296"/>
             <w:shd w:fill="FFFFFF"/>
             <w:tcMar>
               <w:top w:w="100" w:type="dxa"/>
@@ -1649,7 +1649,261 @@
                 <w:color w:val="2D3748"/>
                 <w:sz w:val="19"/>
               </w:rPr>
-              <w:t>Extreme concurrency limits &amp; socket stress test</w:t>
+              <w:t>60s</w:t>
+            </w:r>
+          </w:p>
+        </w:tc>
+      </w:tr>
+      <w:tr>
+        <w:tc>
+          <w:tcPr>
+            <w:tcW w:type="dxa" w:w="2304"/>
+            <w:shd w:fill="F7FAFC"/>
+            <w:tcMar>
+              <w:top w:w="100" w:type="dxa"/>
+              <w:bottom w:w="100" w:type="dxa"/>
+              <w:left w:w="150" w:type="dxa"/>
+              <w:right w:w="150" w:type="dxa"/>
+            </w:tcMar>
+          </w:tcPr>
+          <w:p>
+            <w:pPr>
+              <w:jc w:val="left"/>
+            </w:pPr>
+            <w:r>
+              <w:rPr>
+                <w:rFonts w:ascii="Calibri" w:hAnsi="Calibri"/>
+                <w:color w:val="2D3748"/>
+                <w:sz w:val="19"/>
+              </w:rPr>
+              <w:t>High-density website</w:t>
+            </w:r>
+          </w:p>
+        </w:tc>
+        <w:tc>
+          <w:tcPr>
+            <w:tcW w:type="dxa" w:w="2880"/>
+            <w:shd w:fill="F7FAFC"/>
+            <w:tcMar>
+              <w:top w:w="100" w:type="dxa"/>
+              <w:bottom w:w="100" w:type="dxa"/>
+              <w:left w:w="150" w:type="dxa"/>
+              <w:right w:w="150" w:type="dxa"/>
+            </w:tcMar>
+          </w:tcPr>
+          <w:p>
+            <w:pPr>
+              <w:jc w:val="left"/>
+            </w:pPr>
+            <w:r>
+              <w:rPr>
+                <w:rFonts w:ascii="Calibri" w:hAnsi="Calibri"/>
+                <w:color w:val="2D3748"/>
+                <w:sz w:val="19"/>
+              </w:rPr>
+              <w:t>Popular portals SaaS platforms</w:t>
+            </w:r>
+          </w:p>
+        </w:tc>
+        <w:tc>
+          <w:tcPr>
+            <w:tcW w:type="dxa" w:w="1296"/>
+            <w:shd w:fill="F7FAFC"/>
+            <w:tcMar>
+              <w:top w:w="100" w:type="dxa"/>
+              <w:bottom w:w="100" w:type="dxa"/>
+              <w:left w:w="150" w:type="dxa"/>
+              <w:right w:w="150" w:type="dxa"/>
+            </w:tcMar>
+          </w:tcPr>
+          <w:p>
+            <w:pPr>
+              <w:jc w:val="left"/>
+            </w:pPr>
+            <w:r>
+              <w:rPr>
+                <w:rFonts w:ascii="Calibri" w:hAnsi="Calibri"/>
+                <w:color w:val="2D3748"/>
+                <w:sz w:val="19"/>
+              </w:rPr>
+              <w:t>8</w:t>
+            </w:r>
+          </w:p>
+        </w:tc>
+        <w:tc>
+          <w:tcPr>
+            <w:tcW w:type="dxa" w:w="1584"/>
+            <w:shd w:fill="F7FAFC"/>
+            <w:tcMar>
+              <w:top w:w="100" w:type="dxa"/>
+              <w:bottom w:w="100" w:type="dxa"/>
+              <w:left w:w="150" w:type="dxa"/>
+              <w:right w:w="150" w:type="dxa"/>
+            </w:tcMar>
+          </w:tcPr>
+          <w:p>
+            <w:pPr>
+              <w:jc w:val="left"/>
+            </w:pPr>
+            <w:r>
+              <w:rPr>
+                <w:rFonts w:ascii="Calibri" w:hAnsi="Calibri"/>
+                <w:color w:val="2D3748"/>
+                <w:sz w:val="19"/>
+              </w:rPr>
+              <w:t>2,000</w:t>
+            </w:r>
+          </w:p>
+        </w:tc>
+        <w:tc>
+          <w:tcPr>
+            <w:tcW w:type="dxa" w:w="1296"/>
+            <w:shd w:fill="F7FAFC"/>
+            <w:tcMar>
+              <w:top w:w="100" w:type="dxa"/>
+              <w:bottom w:w="100" w:type="dxa"/>
+              <w:left w:w="150" w:type="dxa"/>
+              <w:right w:w="150" w:type="dxa"/>
+            </w:tcMar>
+          </w:tcPr>
+          <w:p>
+            <w:pPr>
+              <w:jc w:val="left"/>
+            </w:pPr>
+            <w:r>
+              <w:rPr>
+                <w:rFonts w:ascii="Calibri" w:hAnsi="Calibri"/>
+                <w:color w:val="2D3748"/>
+                <w:sz w:val="19"/>
+              </w:rPr>
+              <w:t>120s</w:t>
+            </w:r>
+          </w:p>
+        </w:tc>
+      </w:tr>
+      <w:tr>
+        <w:tc>
+          <w:tcPr>
+            <w:tcW w:type="dxa" w:w="2304"/>
+            <w:shd w:fill="FFFFFF"/>
+            <w:tcMar>
+              <w:top w:w="100" w:type="dxa"/>
+              <w:bottom w:w="100" w:type="dxa"/>
+              <w:left w:w="150" w:type="dxa"/>
+              <w:right w:w="150" w:type="dxa"/>
+            </w:tcMar>
+          </w:tcPr>
+          <w:p>
+            <w:pPr>
+              <w:jc w:val="left"/>
+            </w:pPr>
+            <w:r>
+              <w:rPr>
+                <w:rFonts w:ascii="Calibri" w:hAnsi="Calibri"/>
+                <w:color w:val="2D3748"/>
+                <w:sz w:val="19"/>
+              </w:rPr>
+              <w:t>Stress testing</w:t>
+            </w:r>
+          </w:p>
+        </w:tc>
+        <w:tc>
+          <w:tcPr>
+            <w:tcW w:type="dxa" w:w="2880"/>
+            <w:shd w:fill="FFFFFF"/>
+            <w:tcMar>
+              <w:top w:w="100" w:type="dxa"/>
+              <w:bottom w:w="100" w:type="dxa"/>
+              <w:left w:w="150" w:type="dxa"/>
+              <w:right w:w="150" w:type="dxa"/>
+            </w:tcMar>
+          </w:tcPr>
+          <w:p>
+            <w:pPr>
+              <w:jc w:val="left"/>
+            </w:pPr>
+            <w:r>
+              <w:rPr>
+                <w:rFonts w:ascii="Calibri" w:hAnsi="Calibri"/>
+                <w:color w:val="2D3748"/>
+                <w:sz w:val="19"/>
+              </w:rPr>
+              <w:t>Find saturation point</w:t>
+            </w:r>
+          </w:p>
+        </w:tc>
+        <w:tc>
+          <w:tcPr>
+            <w:tcW w:type="dxa" w:w="1296"/>
+            <w:shd w:fill="FFFFFF"/>
+            <w:tcMar>
+              <w:top w:w="100" w:type="dxa"/>
+              <w:bottom w:w="100" w:type="dxa"/>
+              <w:left w:w="150" w:type="dxa"/>
+              <w:right w:w="150" w:type="dxa"/>
+            </w:tcMar>
+          </w:tcPr>
+          <w:p>
+            <w:pPr>
+              <w:jc w:val="left"/>
+            </w:pPr>
+            <w:r>
+              <w:rPr>
+                <w:rFonts w:ascii="Calibri" w:hAnsi="Calibri"/>
+                <w:color w:val="2D3748"/>
+                <w:sz w:val="19"/>
+              </w:rPr>
+              <w:t>16</w:t>
+            </w:r>
+          </w:p>
+        </w:tc>
+        <w:tc>
+          <w:tcPr>
+            <w:tcW w:type="dxa" w:w="1584"/>
+            <w:shd w:fill="FFFFFF"/>
+            <w:tcMar>
+              <w:top w:w="100" w:type="dxa"/>
+              <w:bottom w:w="100" w:type="dxa"/>
+              <w:left w:w="150" w:type="dxa"/>
+              <w:right w:w="150" w:type="dxa"/>
+            </w:tcMar>
+          </w:tcPr>
+          <w:p>
+            <w:pPr>
+              <w:jc w:val="left"/>
+            </w:pPr>
+            <w:r>
+              <w:rPr>
+                <w:rFonts w:ascii="Calibri" w:hAnsi="Calibri"/>
+                <w:color w:val="2D3748"/>
+                <w:sz w:val="19"/>
+              </w:rPr>
+              <w:t>10,000</w:t>
+            </w:r>
+          </w:p>
+        </w:tc>
+        <w:tc>
+          <w:tcPr>
+            <w:tcW w:type="dxa" w:w="1296"/>
+            <w:shd w:fill="FFFFFF"/>
+            <w:tcMar>
+              <w:top w:w="100" w:type="dxa"/>
+              <w:bottom w:w="100" w:type="dxa"/>
+              <w:left w:w="150" w:type="dxa"/>
+              <w:right w:w="150" w:type="dxa"/>
+            </w:tcMar>
+          </w:tcPr>
+          <w:p>
+            <w:pPr>
+              <w:jc w:val="left"/>
+            </w:pPr>
+            <w:r>
+              <w:rPr>
+                <w:rFonts w:ascii="Calibri" w:hAnsi="Calibri"/>
+                <w:color w:val="2D3748"/>
+                <w:sz w:val="19"/>
+              </w:rPr>
+              <w:t>300s</w:t>
             </w:r>
           </w:p>
         </w:tc>
@@ -2586,7 +2840,7 @@
           <w:color w:val="4A5568"/>
           <w:sz w:val="19"/>
         </w:rPr>
-        <w:t xml:space="preserve">   cd main_web_benchmark/GET/get_no_index &amp;&amp; python3 run_bme_wrk.py --tier all</w:t>
+        <w:t xml:space="preserve">   cd main_web_benchmark/GET/get_no_index &amp;&amp; python3 run_bme_wrk.py --tier all --runs 3</w:t>
       </w:r>
     </w:p>
     <w:p>
@@ -2606,7 +2860,7 @@
           <w:color w:val="4A5568"/>
           <w:sz w:val="19"/>
         </w:rPr>
-        <w:t xml:space="preserve">   cd main_web_benchmark/GET/get_no_index &amp;&amp; python3 run_dkr_wrk.py --tier all</w:t>
+        <w:t xml:space="preserve">   cd main_web_benchmark/GET/get_no_index &amp;&amp; python3 run_dkr_wrk.py --tier all --runs 3</w:t>
       </w:r>
     </w:p>
     <w:p>
@@ -2618,7 +2872,27 @@
           <w:b/>
           <w:color w:val="1A365D"/>
         </w:rPr>
-        <w:t>▶ Step 4: Generate Side-by-Side Comparison Tables</w:t>
+        <w:t>▶ Step 4: View Averaged &amp; Raw Results</w:t>
+        <w:br/>
+      </w:r>
+      <w:r>
+        <w:rPr>
+          <w:color w:val="4A5568"/>
+          <w:sz w:val="19"/>
+        </w:rPr>
+        <w:t xml:space="preserve">   Averaged metrics are in bme_benchmark_results.json; full raw iteration data is saved in raw_results.json (and results/raw_results/).</w:t>
+      </w:r>
+    </w:p>
+    <w:p>
+      <w:pPr>
+        <w:spacing w:after="80"/>
+      </w:pPr>
+      <w:r>
+        <w:rPr>
+          <w:b/>
+          <w:color w:val="1A365D"/>
+        </w:rPr>
+        <w:t>▶ Step 5: Generate Comparison Tables</w:t>
         <w:br/>
       </w:r>
       <w:r>

</xml_diff>